<commit_message>
Hub: workspace bundle export/restore
</commit_message>
<xml_diff>
--- a/docs/network-analyzer-guide.docx
+++ b/docs/network-analyzer-guide.docx
@@ -561,6 +561,14 @@
     </w:p>
     <w:p>
       <w:pPr>
+        <w:pStyle w:val="ListBullet"/>
+      </w:pPr>
+      <w:r>
+        <w:t>2026-10-07 新增「工作區打包」：把各工具存在這個瀏覽器的設定（log 篩選條件與自訂規則、防火牆接受風險／命名規則／到期關鍵字、交換器黃金範本、稽核工作底稿、健康度歷史、活動時間軸、語言與主題）匯出成一個 JSON 檔，換電腦或交接時按「還原工作區」一次還原，重新開啟各工具即套用。產生器模板與草稿可能含 IP、帳號、密碼，預設不附，勾選後才附上，也可一併附加去識別化對照表、log 基準線等檔案（對照表含原始資料，請只透過信任的管道傳遞）；還原時附加檔案會列出下載連結，請到對應工具匯入。log 分析的威脅情資、安全清單與 ASN 資料庫原本就不保存在瀏覽器，不會自動打包。</w:t>
+      </w:r>
+    </w:p>
+    <w:p>
+      <w:pPr>
         <w:pStyle w:val="Heading1"/>
       </w:pPr>
       <w:r>

</xml_diff>